<commit_message>
ini revisi dari dokumen yang sebelumnya pak
buat ngelakuin staging changes, saya gak bisa gara-gara pake pc di lab mobile pak, gak ada visual studio codenya pak kalo di pc lab mobile
</commit_message>
<xml_diff>
--- a/BAB 3 Piranti Interaktif/Bab 3 Piranti Interaktif.docx
+++ b/BAB 3 Piranti Interaktif/Bab 3 Piranti Interaktif.docx
@@ -1,6 +1,6 @@
 
 <file path=word/document.xml><?xml version="1.0" encoding="utf-8"?>
-<w:document xmlns:wpc="http://schemas.microsoft.com/office/word/2010/wordprocessingCanvas" xmlns:cx="http://schemas.microsoft.com/office/drawing/2014/chartex" xmlns:cx1="http://schemas.microsoft.com/office/drawing/2015/9/8/chartex" xmlns:cx2="http://schemas.microsoft.com/office/drawing/2015/10/21/chartex" xmlns:cx3="http://schemas.microsoft.com/office/drawing/2016/5/9/chartex" xmlns:cx4="http://schemas.microsoft.com/office/drawing/2016/5/10/chartex" xmlns:cx5="http://schemas.microsoft.com/office/drawing/2016/5/11/chartex" xmlns:cx6="http://schemas.microsoft.com/office/drawing/2016/5/12/chartex" xmlns:cx7="http://schemas.microsoft.com/office/drawing/2016/5/13/chartex" xmlns:cx8="http://schemas.microsoft.com/office/drawing/2016/5/14/chartex" xmlns:mc="http://schemas.openxmlformats.org/markup-compatibility/2006" xmlns:aink="http://schemas.microsoft.com/office/drawing/2016/ink" xmlns:am3d="http://schemas.microsoft.com/office/drawing/2017/model3d" xmlns:o="urn:schemas-microsoft-com:office:office" xmlns:oel="http://schemas.microsoft.com/office/2019/extlst" xmlns:r="http://schemas.openxmlformats.org/officeDocument/2006/relationships" xmlns:m="http://schemas.openxmlformats.org/officeDocument/2006/math" xmlns:v="urn:schemas-microsoft-com:vml" xmlns:wp14="http://schemas.microsoft.com/office/word/2010/wordprocessingDrawing" xmlns:wp="http://schemas.openxmlformats.org/drawingml/2006/wordprocessingDrawing" xmlns:w10="urn:schemas-microsoft-com:office:word" xmlns:w="http://schemas.openxmlformats.org/wordprocessingml/2006/main" xmlns:w14="http://schemas.microsoft.com/office/word/2010/wordml" xmlns:w15="http://schemas.microsoft.com/office/word/2012/wordml" xmlns:w16cex="http://schemas.microsoft.com/office/word/2018/wordml/cex" xmlns:w16cid="http://schemas.microsoft.com/office/word/2016/wordml/cid" xmlns:w16="http://schemas.microsoft.com/office/word/2018/wordml" xmlns:w16du="http://schemas.microsoft.com/office/word/2023/wordml/word16du" xmlns:w16sdtdh="http://schemas.microsoft.com/office/word/2020/wordml/sdtdatahash" xmlns:w16sdtfl="http://schemas.microsoft.com/office/word/2024/wordml/sdtformatlock" xmlns:w16se="http://schemas.microsoft.com/office/word/2015/wordml/symex" xmlns:wpg="http://schemas.microsoft.com/office/word/2010/wordprocessingGroup" xmlns:wpi="http://schemas.microsoft.com/office/word/2010/wordprocessingInk" xmlns:wne="http://schemas.microsoft.com/office/word/2006/wordml" xmlns:wps="http://schemas.microsoft.com/office/word/2010/wordprocessingShape" mc:Ignorable="w14 w15 w16se w16cid w16 w16cex w16sdtdh w16sdtfl w16du wp14">
+<w:document xmlns:wpc="http://schemas.microsoft.com/office/word/2010/wordprocessingCanvas" xmlns:cx="http://schemas.microsoft.com/office/drawing/2014/chartex" xmlns:mc="http://schemas.openxmlformats.org/markup-compatibility/2006" xmlns:o="urn:schemas-microsoft-com:office:office" xmlns:r="http://schemas.openxmlformats.org/officeDocument/2006/relationships" xmlns:m="http://schemas.openxmlformats.org/officeDocument/2006/math" xmlns:v="urn:schemas-microsoft-com:vml" xmlns:wp14="http://schemas.microsoft.com/office/word/2010/wordprocessingDrawing" xmlns:wp="http://schemas.openxmlformats.org/drawingml/2006/wordprocessingDrawing" xmlns:w10="urn:schemas-microsoft-com:office:word" xmlns:w="http://schemas.openxmlformats.org/wordprocessingml/2006/main" xmlns:w14="http://schemas.microsoft.com/office/word/2010/wordml" xmlns:w15="http://schemas.microsoft.com/office/word/2012/wordml" xmlns:w16se="http://schemas.microsoft.com/office/word/2015/wordml/symex" xmlns:wpg="http://schemas.microsoft.com/office/word/2010/wordprocessingGroup" xmlns:wpi="http://schemas.microsoft.com/office/word/2010/wordprocessingInk" xmlns:wne="http://schemas.microsoft.com/office/word/2006/wordml" xmlns:wps="http://schemas.microsoft.com/office/word/2010/wordprocessingShape" mc:Ignorable="w14 w15 w16se wp14">
   <w:body>
     <w:p>
       <w:pPr>
@@ -52,18 +52,20 @@
           <w:sz w:val="36"/>
           <w:szCs w:val="36"/>
         </w:rPr>
-        <w:t xml:space="preserve">“PIRANTI </w:t>
-      </w:r>
-      <w:proofErr w:type="gramStart"/>
-      <w:r>
+        <w:t>“PIRANTI INTERAKTIF“</w:t>
+      </w:r>
+    </w:p>
+    <w:p>
+      <w:pPr>
+        <w:spacing w:line="240" w:lineRule="auto"/>
+        <w:ind w:left="567" w:right="686"/>
+        <w:jc w:val="center"/>
         <w:rPr>
           <w:rFonts w:ascii="Times New Roman" w:eastAsia="Times New Roman" w:hAnsi="Times New Roman" w:cs="Times New Roman"/>
           <w:sz w:val="36"/>
           <w:szCs w:val="36"/>
         </w:rPr>
-        <w:t>INTERAKTIF“</w:t>
-      </w:r>
-      <w:proofErr w:type="gramEnd"/>
+      </w:pPr>
     </w:p>
     <w:p>
       <w:pPr>
@@ -71,24 +73,13 @@
         <w:ind w:left="567" w:right="686"/>
         <w:jc w:val="center"/>
         <w:rPr>
-          <w:rFonts w:ascii="Times New Roman" w:eastAsia="Times New Roman" w:hAnsi="Times New Roman" w:cs="Times New Roman"/>
-          <w:sz w:val="36"/>
-          <w:szCs w:val="36"/>
-        </w:rPr>
-      </w:pPr>
-    </w:p>
-    <w:p>
-      <w:pPr>
-        <w:spacing w:line="240" w:lineRule="auto"/>
-        <w:ind w:left="567" w:right="686"/>
-        <w:jc w:val="center"/>
-        <w:rPr>
           <w:rFonts w:ascii="Calibri" w:eastAsia="Calibri" w:hAnsi="Calibri" w:cs="Calibri"/>
         </w:rPr>
       </w:pPr>
       <w:r>
         <w:rPr>
           <w:noProof/>
+          <w:lang w:val="en-US" w:eastAsia="en-US"/>
         </w:rPr>
         <mc:AlternateContent>
           <mc:Choice Requires="wpg">
@@ -136,7 +127,7 @@
               </wp:anchor>
             </w:drawing>
           </mc:Choice>
-          <mc:Fallback xmlns:cr="http://schemas.microsoft.com/office/comments/2020/reactions" xmlns="http://schemas.microsoft.com/office/tasks/2019/documenttasks" xmlns:dgm="http://schemas.openxmlformats.org/drawingml/2006/diagram" xmlns:lc="http://schemas.openxmlformats.org/drawingml/2006/lockedCanvas" xmlns:c="http://schemas.openxmlformats.org/drawingml/2006/chart" xmlns:pic="http://schemas.openxmlformats.org/drawingml/2006/picture" xmlns:a="http://schemas.openxmlformats.org/drawingml/2006/main" xmlns:sl="http://schemas.openxmlformats.org/schemaLibrary/2006/main">
+          <mc:Fallback xmlns:sl="http://schemas.openxmlformats.org/schemaLibrary/2006/main" xmlns:a="http://schemas.openxmlformats.org/drawingml/2006/main" xmlns:pic="http://schemas.openxmlformats.org/drawingml/2006/picture" xmlns:c="http://schemas.openxmlformats.org/drawingml/2006/chart" xmlns:lc="http://schemas.openxmlformats.org/drawingml/2006/lockedCanvas" xmlns:dgm="http://schemas.openxmlformats.org/drawingml/2006/diagram" xmlns="http://schemas.microsoft.com/office/tasks/2019/documenttasks" xmlns:cr="http://schemas.microsoft.com/office/comments/2020/reactions" xmlns:w16sdtfl="http://schemas.microsoft.com/office/word/2024/wordml/sdtformatlock" xmlns:w16sdtdh="http://schemas.microsoft.com/office/word/2020/wordml/sdtdatahash" xmlns:w16du="http://schemas.microsoft.com/office/word/2023/wordml/word16du" xmlns:w16="http://schemas.microsoft.com/office/word/2018/wordml" xmlns:w16cid="http://schemas.microsoft.com/office/word/2016/wordml/cid" xmlns:w16cex="http://schemas.microsoft.com/office/word/2018/wordml/cex" xmlns:oel="http://schemas.microsoft.com/office/2019/extlst" xmlns:am3d="http://schemas.microsoft.com/office/drawing/2017/model3d" xmlns:aink="http://schemas.microsoft.com/office/drawing/2016/ink" xmlns:cx8="http://schemas.microsoft.com/office/drawing/2016/5/14/chartex" xmlns:cx7="http://schemas.microsoft.com/office/drawing/2016/5/13/chartex" xmlns:cx6="http://schemas.microsoft.com/office/drawing/2016/5/12/chartex" xmlns:cx5="http://schemas.microsoft.com/office/drawing/2016/5/11/chartex" xmlns:cx4="http://schemas.microsoft.com/office/drawing/2016/5/10/chartex" xmlns:cx3="http://schemas.microsoft.com/office/drawing/2016/5/9/chartex" xmlns:cx2="http://schemas.microsoft.com/office/drawing/2015/10/21/chartex" xmlns:cx1="http://schemas.microsoft.com/office/drawing/2015/9/8/chartex">
             <w:drawing>
               <wp:anchor allowOverlap="1" behindDoc="0" distB="0" distT="0" distL="114300" distR="114300" hidden="0" layoutInCell="1" locked="0" relativeHeight="0" simplePos="0">
                 <wp:simplePos x="0" y="0"/>
@@ -246,6 +237,7 @@
         <w:rPr>
           <w:rFonts w:ascii="Calibri" w:eastAsia="Calibri" w:hAnsi="Calibri" w:cs="Calibri"/>
           <w:noProof/>
+          <w:lang w:val="en-US" w:eastAsia="en-US"/>
         </w:rPr>
         <w:drawing>
           <wp:inline distT="0" distB="0" distL="0" distR="0" wp14:anchorId="2F0926F3" wp14:editId="0D27F280">
@@ -381,18 +373,8 @@
           <w:sz w:val="32"/>
           <w:szCs w:val="32"/>
         </w:rPr>
-        <w:t xml:space="preserve">Bryan Lefrans </w:t>
-      </w:r>
-      <w:proofErr w:type="gramStart"/>
-      <w:r>
-        <w:rPr>
-          <w:rFonts w:ascii="Times New Roman" w:eastAsia="Times New Roman" w:hAnsi="Times New Roman" w:cs="Times New Roman"/>
-          <w:sz w:val="32"/>
-          <w:szCs w:val="32"/>
-        </w:rPr>
-        <w:t>Simarmata  20235520006</w:t>
-      </w:r>
-      <w:proofErr w:type="gramEnd"/>
+        <w:t>Bryan Lefrans Simarmata  20235520006</w:t>
+      </w:r>
     </w:p>
     <w:p>
       <w:pPr>
@@ -437,7 +419,6 @@
       </w:pPr>
       <w:bookmarkStart w:id="1" w:name="_e1dm2934gu3c" w:colFirst="0" w:colLast="0"/>
       <w:bookmarkEnd w:id="1"/>
-      <w:commentRangeStart w:id="2"/>
       <w:r>
         <w:lastRenderedPageBreak/>
         <w:t>Bab 3 Piranti Interaktif</w:t>
@@ -454,52 +435,881 @@
         <w:t>3.1 Pengertian Piranti Interakti</w:t>
       </w:r>
       <w:r>
-        <w:t xml:space="preserve">f </w:t>
-      </w:r>
-    </w:p>
-    <w:p>
-      <w:pPr>
-        <w:jc w:val="both"/>
-      </w:pPr>
-      <w:r>
-        <w:t xml:space="preserve">Piranti interaktif dalam Interaksi Manusia dan Komputer (IMK) adalah perangkat yang memungkinkan komunikasi antara manusia dan komputer melalui berbagai saluran komunikasi (Simarmata, 2006, 2010). Komputer mengolah dan menyimpan data dalam bentuk digital atau bilangan biner, yang hanya mengenal dua nilai: 1 dan 0 (Mulyana, 2016).  </w:t>
-      </w:r>
-    </w:p>
-    <w:p>
-      <w:pPr>
-        <w:jc w:val="both"/>
-      </w:pPr>
-    </w:p>
-    <w:p>
-      <w:pPr>
-        <w:jc w:val="both"/>
-      </w:pPr>
-      <w:r>
-        <w:t xml:space="preserve">Dalam IMK, piranti interaktif terbagi menjadi:  </w:t>
-      </w:r>
-    </w:p>
-    <w:p>
-      <w:pPr>
-        <w:jc w:val="both"/>
-      </w:pPr>
-      <w:r>
-        <w:t xml:space="preserve">- *Piranti Input*: Perangkat untuk memasukkan data ke komputer, seperti keyboard dan mouse.  </w:t>
-      </w:r>
-    </w:p>
-    <w:p>
-      <w:pPr>
-        <w:jc w:val="both"/>
-      </w:pPr>
-      <w:r>
-        <w:t>- *Piranti Output*: Perangkat untuk menampilkan atau mengeluarkan hasil dari komputer, seperti monitor dan speaker.</w:t>
-      </w:r>
-      <w:commentRangeEnd w:id="2"/>
-      <w:r>
-        <w:rPr>
-          <w:rStyle w:val="CommentReference"/>
-        </w:rPr>
-        <w:commentReference w:id="2"/>
-      </w:r>
+        <w:t>f</w:t>
+      </w:r>
+    </w:p>
+    <w:p>
+      <w:pPr>
+        <w:jc w:val="both"/>
+      </w:pPr>
+      <w:r>
+        <w:t xml:space="preserve"> </w:t>
+      </w:r>
+    </w:p>
+    <w:p>
+      <w:pPr>
+        <w:pStyle w:val="NormalWeb"/>
+        <w:spacing w:before="0" w:beforeAutospacing="0" w:after="0" w:afterAutospacing="0"/>
+        <w:ind w:firstLine="720"/>
+        <w:jc w:val="both"/>
+      </w:pPr>
+      <w:r>
+        <w:rPr>
+          <w:rFonts w:ascii="Arial" w:hAnsi="Arial" w:cs="Arial"/>
+          <w:color w:val="000000"/>
+          <w:sz w:val="22"/>
+          <w:szCs w:val="22"/>
+        </w:rPr>
+        <w:t>Piranti interaktif dalam Interaksi Manusia dan Komputer (IMK) adalah perangkat yang memungkinkan komunikasi antara manusia dan komputer melalui berbagai saluran komunikasi (</w:t>
+      </w:r>
+      <w:r>
+        <w:rPr>
+          <w:rFonts w:ascii="Arial" w:hAnsi="Arial" w:cs="Arial"/>
+          <w:b/>
+          <w:color w:val="000000"/>
+          <w:sz w:val="22"/>
+          <w:szCs w:val="22"/>
+        </w:rPr>
+        <w:t>Simarmata</w:t>
+      </w:r>
+      <w:r>
+        <w:rPr>
+          <w:rFonts w:ascii="Arial" w:hAnsi="Arial" w:cs="Arial"/>
+          <w:color w:val="000000"/>
+          <w:sz w:val="22"/>
+          <w:szCs w:val="22"/>
+        </w:rPr>
+        <w:t>, 2006, 2010). Komputer mengolah dan menyimpan data dalam bentuk digital atau bilangan biner, yang hanya mengenal dua nilai: 1 dan 0 (</w:t>
+      </w:r>
+      <w:r>
+        <w:rPr>
+          <w:rFonts w:ascii="Arial" w:hAnsi="Arial" w:cs="Arial"/>
+          <w:b/>
+          <w:color w:val="000000"/>
+          <w:sz w:val="22"/>
+          <w:szCs w:val="22"/>
+        </w:rPr>
+        <w:t>Mulyana</w:t>
+      </w:r>
+      <w:r>
+        <w:rPr>
+          <w:rFonts w:ascii="Arial" w:hAnsi="Arial" w:cs="Arial"/>
+          <w:color w:val="000000"/>
+          <w:sz w:val="22"/>
+          <w:szCs w:val="22"/>
+        </w:rPr>
+        <w:t>, 2016).  </w:t>
+      </w:r>
+    </w:p>
+    <w:p>
+      <w:pPr>
+        <w:spacing w:line="240" w:lineRule="auto"/>
+        <w:rPr>
+          <w:rFonts w:ascii="Times New Roman" w:eastAsia="Times New Roman" w:hAnsi="Times New Roman" w:cs="Times New Roman"/>
+          <w:sz w:val="24"/>
+          <w:szCs w:val="24"/>
+          <w:lang w:val="en-US" w:eastAsia="en-US"/>
+        </w:rPr>
+      </w:pPr>
+    </w:p>
+    <w:p>
+      <w:pPr>
+        <w:spacing w:line="240" w:lineRule="auto"/>
+        <w:ind w:firstLine="720"/>
+        <w:jc w:val="both"/>
+        <w:rPr>
+          <w:rFonts w:ascii="Times New Roman" w:eastAsia="Times New Roman" w:hAnsi="Times New Roman" w:cs="Times New Roman"/>
+          <w:sz w:val="24"/>
+          <w:szCs w:val="24"/>
+          <w:lang w:val="en-US" w:eastAsia="en-US"/>
+        </w:rPr>
+      </w:pPr>
+      <w:r>
+        <w:rPr>
+          <w:rFonts w:eastAsia="Times New Roman"/>
+          <w:color w:val="000000"/>
+          <w:lang w:val="en-US" w:eastAsia="en-US"/>
+        </w:rPr>
+        <w:t>Dalam IMK, piranti interaktif terbagi menjadi:  </w:t>
+      </w:r>
+    </w:p>
+    <w:p>
+      <w:pPr>
+        <w:spacing w:line="240" w:lineRule="auto"/>
+        <w:jc w:val="both"/>
+        <w:rPr>
+          <w:rFonts w:ascii="Times New Roman" w:eastAsia="Times New Roman" w:hAnsi="Times New Roman" w:cs="Times New Roman"/>
+          <w:sz w:val="24"/>
+          <w:szCs w:val="24"/>
+          <w:lang w:val="en-US" w:eastAsia="en-US"/>
+        </w:rPr>
+      </w:pPr>
+      <w:r>
+        <w:rPr>
+          <w:rFonts w:eastAsia="Times New Roman"/>
+          <w:color w:val="000000"/>
+          <w:lang w:val="en-US" w:eastAsia="en-US"/>
+        </w:rPr>
+        <w:t>- Piranti Input</w:t>
+      </w:r>
+      <w:r>
+        <w:rPr>
+          <w:rFonts w:eastAsia="Times New Roman"/>
+          <w:color w:val="000000"/>
+          <w:lang w:val="en-US" w:eastAsia="en-US"/>
+        </w:rPr>
+        <w:t>: Perangkat untuk memasukkan data ke komputer, seperti keyboard dan mouse.  </w:t>
+      </w:r>
+    </w:p>
+    <w:p>
+      <w:pPr>
+        <w:spacing w:line="240" w:lineRule="auto"/>
+        <w:jc w:val="both"/>
+        <w:rPr>
+          <w:rFonts w:ascii="Times New Roman" w:eastAsia="Times New Roman" w:hAnsi="Times New Roman" w:cs="Times New Roman"/>
+          <w:sz w:val="24"/>
+          <w:szCs w:val="24"/>
+          <w:lang w:val="en-US" w:eastAsia="en-US"/>
+        </w:rPr>
+      </w:pPr>
+      <w:r>
+        <w:rPr>
+          <w:rFonts w:eastAsia="Times New Roman"/>
+          <w:color w:val="000000"/>
+          <w:lang w:val="en-US" w:eastAsia="en-US"/>
+        </w:rPr>
+        <w:t>- Piranti Output</w:t>
+      </w:r>
+      <w:r>
+        <w:rPr>
+          <w:rFonts w:eastAsia="Times New Roman"/>
+          <w:color w:val="000000"/>
+          <w:lang w:val="en-US" w:eastAsia="en-US"/>
+        </w:rPr>
+        <w:t>: Perangkat untuk menampilkan atau mengeluarkan hasil dari komputer, seperti monitor dan speaker.</w:t>
+      </w:r>
+    </w:p>
+    <w:p>
+      <w:pPr>
+        <w:spacing w:line="240" w:lineRule="auto"/>
+        <w:rPr>
+          <w:rFonts w:ascii="Times New Roman" w:eastAsia="Times New Roman" w:hAnsi="Times New Roman" w:cs="Times New Roman"/>
+          <w:sz w:val="24"/>
+          <w:szCs w:val="24"/>
+          <w:lang w:val="en-US" w:eastAsia="en-US"/>
+        </w:rPr>
+      </w:pPr>
+    </w:p>
+    <w:p>
+      <w:pPr>
+        <w:spacing w:line="240" w:lineRule="auto"/>
+        <w:jc w:val="both"/>
+        <w:rPr>
+          <w:rFonts w:eastAsia="Times New Roman"/>
+          <w:b/>
+          <w:bCs/>
+          <w:color w:val="000000"/>
+          <w:lang w:val="en-US" w:eastAsia="en-US"/>
+        </w:rPr>
+      </w:pPr>
+      <w:r>
+        <w:rPr>
+          <w:rFonts w:eastAsia="Times New Roman"/>
+          <w:b/>
+          <w:bCs/>
+          <w:color w:val="000000"/>
+          <w:lang w:val="en-US" w:eastAsia="en-US"/>
+        </w:rPr>
+        <w:t>3.2 Piranti Masukan Tekstual (Bryan)</w:t>
+      </w:r>
+    </w:p>
+    <w:p>
+      <w:pPr>
+        <w:spacing w:line="240" w:lineRule="auto"/>
+        <w:jc w:val="both"/>
+        <w:rPr>
+          <w:rFonts w:ascii="Times New Roman" w:eastAsia="Times New Roman" w:hAnsi="Times New Roman" w:cs="Times New Roman"/>
+          <w:sz w:val="24"/>
+          <w:szCs w:val="24"/>
+          <w:lang w:val="en-US" w:eastAsia="en-US"/>
+        </w:rPr>
+      </w:pPr>
+    </w:p>
+    <w:p>
+      <w:pPr>
+        <w:spacing w:line="240" w:lineRule="auto"/>
+        <w:ind w:firstLine="720"/>
+        <w:jc w:val="both"/>
+        <w:rPr>
+          <w:rFonts w:eastAsia="Times New Roman"/>
+          <w:color w:val="000000"/>
+          <w:lang w:val="en-US" w:eastAsia="en-US"/>
+        </w:rPr>
+      </w:pPr>
+      <w:r>
+        <w:rPr>
+          <w:rFonts w:eastAsia="Times New Roman"/>
+          <w:color w:val="000000"/>
+          <w:lang w:val="en-US" w:eastAsia="en-US"/>
+        </w:rPr>
+        <w:t>Piranti masukan tekstual adalah perangkat input standar yang paling umum digunakan, yaitu keyboard. Berikut beberapa jenis keyboard:  </w:t>
+      </w:r>
+    </w:p>
+    <w:p>
+      <w:pPr>
+        <w:spacing w:line="240" w:lineRule="auto"/>
+        <w:ind w:firstLine="720"/>
+        <w:jc w:val="both"/>
+        <w:rPr>
+          <w:rFonts w:ascii="Times New Roman" w:eastAsia="Times New Roman" w:hAnsi="Times New Roman" w:cs="Times New Roman"/>
+          <w:sz w:val="24"/>
+          <w:szCs w:val="24"/>
+          <w:lang w:val="en-US" w:eastAsia="en-US"/>
+        </w:rPr>
+      </w:pPr>
+    </w:p>
+    <w:p>
+      <w:pPr>
+        <w:spacing w:line="240" w:lineRule="auto"/>
+        <w:jc w:val="both"/>
+        <w:rPr>
+          <w:rFonts w:eastAsia="Times New Roman"/>
+          <w:color w:val="000000"/>
+          <w:lang w:val="en-US" w:eastAsia="en-US"/>
+        </w:rPr>
+      </w:pPr>
+      <w:r>
+        <w:rPr>
+          <w:rFonts w:eastAsia="Times New Roman"/>
+          <w:color w:val="000000"/>
+          <w:lang w:val="en-US" w:eastAsia="en-US"/>
+        </w:rPr>
+        <w:t xml:space="preserve">- Keyboard QWERTY: Ditemukan oleh </w:t>
+      </w:r>
+      <w:r>
+        <w:rPr>
+          <w:rFonts w:eastAsia="Times New Roman"/>
+          <w:b/>
+          <w:color w:val="000000"/>
+          <w:lang w:val="en-US" w:eastAsia="en-US"/>
+        </w:rPr>
+        <w:t>Scholes</w:t>
+      </w:r>
+      <w:r>
+        <w:rPr>
+          <w:rFonts w:eastAsia="Times New Roman"/>
+          <w:color w:val="000000"/>
+          <w:lang w:val="en-US" w:eastAsia="en-US"/>
+        </w:rPr>
+        <w:t xml:space="preserve">, </w:t>
+      </w:r>
+      <w:r>
+        <w:rPr>
+          <w:rFonts w:eastAsia="Times New Roman"/>
+          <w:b/>
+          <w:color w:val="000000"/>
+          <w:lang w:val="en-US" w:eastAsia="en-US"/>
+        </w:rPr>
+        <w:t>Glidden</w:t>
+      </w:r>
+      <w:r>
+        <w:rPr>
+          <w:rFonts w:eastAsia="Times New Roman"/>
+          <w:color w:val="000000"/>
+          <w:lang w:val="en-US" w:eastAsia="en-US"/>
+        </w:rPr>
+        <w:t xml:space="preserve">, dan </w:t>
+      </w:r>
+      <w:r>
+        <w:rPr>
+          <w:rFonts w:eastAsia="Times New Roman"/>
+          <w:b/>
+          <w:color w:val="000000"/>
+          <w:lang w:val="en-US" w:eastAsia="en-US"/>
+        </w:rPr>
+        <w:t>Soule</w:t>
+      </w:r>
+      <w:r>
+        <w:rPr>
+          <w:rFonts w:eastAsia="Times New Roman"/>
+          <w:color w:val="000000"/>
+          <w:lang w:val="en-US" w:eastAsia="en-US"/>
+        </w:rPr>
+        <w:t xml:space="preserve"> (1878), lalu menjadi standar mesin ketik komersial pada 1905. Dirancang untuk meminimalkan kemacetan saat mengetik. </w:t>
+      </w:r>
+    </w:p>
+    <w:p>
+      <w:pPr>
+        <w:spacing w:line="240" w:lineRule="auto"/>
+        <w:jc w:val="both"/>
+        <w:rPr>
+          <w:rFonts w:ascii="Times New Roman" w:eastAsia="Times New Roman" w:hAnsi="Times New Roman" w:cs="Times New Roman"/>
+          <w:sz w:val="24"/>
+          <w:szCs w:val="24"/>
+          <w:lang w:val="en-US" w:eastAsia="en-US"/>
+        </w:rPr>
+      </w:pPr>
+      <w:r>
+        <w:rPr>
+          <w:rFonts w:eastAsia="Times New Roman"/>
+          <w:color w:val="000000"/>
+          <w:lang w:val="en-US" w:eastAsia="en-US"/>
+        </w:rPr>
+        <w:t> </w:t>
+      </w:r>
+    </w:p>
+    <w:p>
+      <w:pPr>
+        <w:spacing w:line="240" w:lineRule="auto"/>
+        <w:jc w:val="both"/>
+        <w:rPr>
+          <w:rFonts w:eastAsia="Times New Roman"/>
+          <w:color w:val="000000"/>
+          <w:lang w:val="en-US" w:eastAsia="en-US"/>
+        </w:rPr>
+      </w:pPr>
+      <w:r>
+        <w:rPr>
+          <w:rFonts w:eastAsia="Times New Roman"/>
+          <w:color w:val="000000"/>
+          <w:lang w:val="en-US" w:eastAsia="en-US"/>
+        </w:rPr>
+        <w:t xml:space="preserve">- Keyboard DVORAK: Susunan hurufnya lebih ergonomis dibanding QWERTY, dengan efisiensi pengetikan 10-15% lebih tinggi </w:t>
+      </w:r>
+      <w:r>
+        <w:rPr>
+          <w:rFonts w:eastAsia="Times New Roman"/>
+          <w:color w:val="000000"/>
+          <w:lang w:val="en-US" w:eastAsia="en-US"/>
+        </w:rPr>
+        <w:t>dan mengurangi kelelahan jari.</w:t>
+      </w:r>
+    </w:p>
+    <w:p>
+      <w:pPr>
+        <w:spacing w:line="240" w:lineRule="auto"/>
+        <w:jc w:val="both"/>
+        <w:rPr>
+          <w:rFonts w:ascii="Times New Roman" w:eastAsia="Times New Roman" w:hAnsi="Times New Roman" w:cs="Times New Roman"/>
+          <w:sz w:val="24"/>
+          <w:szCs w:val="24"/>
+          <w:lang w:val="en-US" w:eastAsia="en-US"/>
+        </w:rPr>
+      </w:pPr>
+    </w:p>
+    <w:p>
+      <w:pPr>
+        <w:spacing w:line="240" w:lineRule="auto"/>
+        <w:jc w:val="both"/>
+        <w:rPr>
+          <w:rFonts w:eastAsia="Times New Roman"/>
+          <w:color w:val="000000"/>
+          <w:lang w:val="en-US" w:eastAsia="en-US"/>
+        </w:rPr>
+      </w:pPr>
+      <w:r>
+        <w:rPr>
+          <w:rFonts w:eastAsia="Times New Roman"/>
+          <w:color w:val="000000"/>
+          <w:lang w:val="en-US" w:eastAsia="en-US"/>
+        </w:rPr>
+        <w:t>- Keyboard Alphabetik: Susunan hurufnya sesuai urutan alfabet, tetapi kurang efi</w:t>
+      </w:r>
+      <w:r>
+        <w:rPr>
+          <w:rFonts w:eastAsia="Times New Roman"/>
+          <w:color w:val="000000"/>
+          <w:lang w:val="en-US" w:eastAsia="en-US"/>
+        </w:rPr>
+        <w:t>sien dalam kecepatan mengetik.</w:t>
+      </w:r>
+    </w:p>
+    <w:p>
+      <w:pPr>
+        <w:spacing w:line="240" w:lineRule="auto"/>
+        <w:jc w:val="both"/>
+        <w:rPr>
+          <w:rFonts w:ascii="Times New Roman" w:eastAsia="Times New Roman" w:hAnsi="Times New Roman" w:cs="Times New Roman"/>
+          <w:sz w:val="24"/>
+          <w:szCs w:val="24"/>
+          <w:lang w:val="en-US" w:eastAsia="en-US"/>
+        </w:rPr>
+      </w:pPr>
+    </w:p>
+    <w:p>
+      <w:pPr>
+        <w:spacing w:line="240" w:lineRule="auto"/>
+        <w:jc w:val="both"/>
+        <w:rPr>
+          <w:rFonts w:eastAsia="Times New Roman"/>
+          <w:color w:val="000000"/>
+          <w:lang w:val="en-US" w:eastAsia="en-US"/>
+        </w:rPr>
+      </w:pPr>
+      <w:r>
+        <w:rPr>
+          <w:rFonts w:eastAsia="Times New Roman"/>
+          <w:color w:val="000000"/>
+          <w:lang w:val="en-US" w:eastAsia="en-US"/>
+        </w:rPr>
+        <w:t>- Keyboard Klockenberg: Dirancang untuk kenyamanan, dengan bagian kiri dan kanan keyboard dipisahkan serta dibuat lebih miring untuk mengurangi beban otot tangan.  </w:t>
+      </w:r>
+    </w:p>
+    <w:p>
+      <w:pPr>
+        <w:spacing w:line="240" w:lineRule="auto"/>
+        <w:jc w:val="both"/>
+        <w:rPr>
+          <w:rFonts w:ascii="Times New Roman" w:eastAsia="Times New Roman" w:hAnsi="Times New Roman" w:cs="Times New Roman"/>
+          <w:sz w:val="24"/>
+          <w:szCs w:val="24"/>
+          <w:lang w:val="en-US" w:eastAsia="en-US"/>
+        </w:rPr>
+      </w:pPr>
+    </w:p>
+    <w:p>
+      <w:pPr>
+        <w:spacing w:line="240" w:lineRule="auto"/>
+        <w:jc w:val="both"/>
+        <w:rPr>
+          <w:rFonts w:eastAsia="Times New Roman"/>
+          <w:color w:val="000000"/>
+          <w:lang w:val="en-US" w:eastAsia="en-US"/>
+        </w:rPr>
+      </w:pPr>
+      <w:r>
+        <w:rPr>
+          <w:rFonts w:eastAsia="Times New Roman"/>
+          <w:color w:val="000000"/>
+          <w:lang w:val="en-US" w:eastAsia="en-US"/>
+        </w:rPr>
+        <w:t>- Keyboard Chord: Memiliki sedikit tombol (4-5), dan huruf dimasukkan dengan menekan kombinasi tombol secara bersamaan.  </w:t>
+      </w:r>
+    </w:p>
+    <w:p>
+      <w:pPr>
+        <w:spacing w:line="240" w:lineRule="auto"/>
+        <w:jc w:val="both"/>
+        <w:rPr>
+          <w:rFonts w:ascii="Times New Roman" w:eastAsia="Times New Roman" w:hAnsi="Times New Roman" w:cs="Times New Roman"/>
+          <w:sz w:val="24"/>
+          <w:szCs w:val="24"/>
+          <w:lang w:val="en-US" w:eastAsia="en-US"/>
+        </w:rPr>
+      </w:pPr>
+    </w:p>
+    <w:p>
+      <w:pPr>
+        <w:spacing w:line="240" w:lineRule="auto"/>
+        <w:jc w:val="both"/>
+        <w:rPr>
+          <w:rFonts w:eastAsia="Times New Roman"/>
+          <w:color w:val="000000"/>
+          <w:lang w:val="en-US" w:eastAsia="en-US"/>
+        </w:rPr>
+      </w:pPr>
+      <w:r>
+        <w:rPr>
+          <w:rFonts w:eastAsia="Times New Roman"/>
+          <w:color w:val="000000"/>
+          <w:lang w:val="en-US" w:eastAsia="en-US"/>
+        </w:rPr>
+        <w:t>- Keyboard Numerik: Mirip dengan kalkulator, digunakan untuk memasukkan angka dalam jumlah besar dengan cepat.  </w:t>
+      </w:r>
+    </w:p>
+    <w:p>
+      <w:pPr>
+        <w:spacing w:line="240" w:lineRule="auto"/>
+        <w:jc w:val="both"/>
+        <w:rPr>
+          <w:rFonts w:ascii="Times New Roman" w:eastAsia="Times New Roman" w:hAnsi="Times New Roman" w:cs="Times New Roman"/>
+          <w:sz w:val="24"/>
+          <w:szCs w:val="24"/>
+          <w:lang w:val="en-US" w:eastAsia="en-US"/>
+        </w:rPr>
+      </w:pPr>
+    </w:p>
+    <w:p>
+      <w:pPr>
+        <w:spacing w:line="240" w:lineRule="auto"/>
+        <w:jc w:val="both"/>
+        <w:rPr>
+          <w:rFonts w:eastAsia="Times New Roman"/>
+          <w:color w:val="000000"/>
+          <w:lang w:val="en-US" w:eastAsia="en-US"/>
+        </w:rPr>
+      </w:pPr>
+      <w:r>
+        <w:rPr>
+          <w:rFonts w:eastAsia="Times New Roman"/>
+          <w:color w:val="000000"/>
+          <w:lang w:val="en-US" w:eastAsia="en-US"/>
+        </w:rPr>
+        <w:t>- Keyboard Maltron: Memiliki bentuk cekung untuk meningkatkan kenyamanan dan efisiensi mengetik dengan 10 jari.  </w:t>
+      </w:r>
+    </w:p>
+    <w:p>
+      <w:pPr>
+        <w:spacing w:line="240" w:lineRule="auto"/>
+        <w:jc w:val="both"/>
+        <w:rPr>
+          <w:rFonts w:ascii="Times New Roman" w:eastAsia="Times New Roman" w:hAnsi="Times New Roman" w:cs="Times New Roman"/>
+          <w:sz w:val="24"/>
+          <w:szCs w:val="24"/>
+          <w:lang w:val="en-US" w:eastAsia="en-US"/>
+        </w:rPr>
+      </w:pPr>
+    </w:p>
+    <w:p>
+      <w:pPr>
+        <w:spacing w:line="240" w:lineRule="auto"/>
+        <w:jc w:val="both"/>
+        <w:rPr>
+          <w:rFonts w:ascii="Times New Roman" w:eastAsia="Times New Roman" w:hAnsi="Times New Roman" w:cs="Times New Roman"/>
+          <w:sz w:val="24"/>
+          <w:szCs w:val="24"/>
+          <w:lang w:val="en-US" w:eastAsia="en-US"/>
+        </w:rPr>
+      </w:pPr>
+      <w:r>
+        <w:rPr>
+          <w:rFonts w:eastAsia="Times New Roman"/>
+          <w:color w:val="000000"/>
+          <w:lang w:val="en-US" w:eastAsia="en-US"/>
+        </w:rPr>
+        <w:t>- Keyboard Proyeksi: Menggunakan sensor gerak dan sistem scanning untuk mengenali gerakan jari seolah-olah menekan tombol.  </w:t>
+      </w:r>
+    </w:p>
+    <w:p>
+      <w:pPr>
+        <w:spacing w:after="240" w:line="240" w:lineRule="auto"/>
+        <w:rPr>
+          <w:rFonts w:ascii="Times New Roman" w:eastAsia="Times New Roman" w:hAnsi="Times New Roman" w:cs="Times New Roman"/>
+          <w:sz w:val="24"/>
+          <w:szCs w:val="24"/>
+          <w:lang w:val="en-US" w:eastAsia="en-US"/>
+        </w:rPr>
+      </w:pPr>
+    </w:p>
+    <w:p>
+      <w:pPr>
+        <w:spacing w:after="240" w:line="240" w:lineRule="auto"/>
+        <w:rPr>
+          <w:rFonts w:ascii="Times New Roman" w:eastAsia="Times New Roman" w:hAnsi="Times New Roman" w:cs="Times New Roman"/>
+          <w:sz w:val="24"/>
+          <w:szCs w:val="24"/>
+          <w:lang w:val="en-US" w:eastAsia="en-US"/>
+        </w:rPr>
+      </w:pPr>
+    </w:p>
+    <w:p>
+      <w:pPr>
+        <w:spacing w:after="240" w:line="240" w:lineRule="auto"/>
+        <w:rPr>
+          <w:rFonts w:ascii="Times New Roman" w:eastAsia="Times New Roman" w:hAnsi="Times New Roman" w:cs="Times New Roman"/>
+          <w:sz w:val="24"/>
+          <w:szCs w:val="24"/>
+          <w:lang w:val="en-US" w:eastAsia="en-US"/>
+        </w:rPr>
+      </w:pPr>
+    </w:p>
+    <w:p>
+      <w:pPr>
+        <w:spacing w:line="240" w:lineRule="auto"/>
+        <w:jc w:val="both"/>
+        <w:rPr>
+          <w:rFonts w:eastAsia="Times New Roman"/>
+          <w:b/>
+          <w:bCs/>
+          <w:color w:val="000000"/>
+          <w:lang w:val="en-US" w:eastAsia="en-US"/>
+        </w:rPr>
+      </w:pPr>
+      <w:r>
+        <w:rPr>
+          <w:rFonts w:eastAsia="Times New Roman"/>
+          <w:b/>
+          <w:bCs/>
+          <w:color w:val="000000"/>
+          <w:lang w:val="en-US" w:eastAsia="en-US"/>
+        </w:rPr>
+        <w:lastRenderedPageBreak/>
+        <w:t>3.3 Piranti Penunjuk dan Pengambil (Ezra)</w:t>
+      </w:r>
+    </w:p>
+    <w:p>
+      <w:pPr>
+        <w:spacing w:line="240" w:lineRule="auto"/>
+        <w:jc w:val="both"/>
+        <w:rPr>
+          <w:rFonts w:ascii="Times New Roman" w:eastAsia="Times New Roman" w:hAnsi="Times New Roman" w:cs="Times New Roman"/>
+          <w:sz w:val="24"/>
+          <w:szCs w:val="24"/>
+          <w:lang w:val="en-US" w:eastAsia="en-US"/>
+        </w:rPr>
+      </w:pPr>
+    </w:p>
+    <w:p>
+      <w:pPr>
+        <w:spacing w:line="240" w:lineRule="auto"/>
+        <w:ind w:firstLine="720"/>
+        <w:jc w:val="both"/>
+        <w:rPr>
+          <w:rFonts w:eastAsia="Times New Roman"/>
+          <w:color w:val="000000"/>
+          <w:lang w:val="en-US" w:eastAsia="en-US"/>
+        </w:rPr>
+      </w:pPr>
+      <w:r>
+        <w:rPr>
+          <w:rFonts w:eastAsia="Times New Roman"/>
+          <w:color w:val="000000"/>
+          <w:lang w:val="en-US" w:eastAsia="en-US"/>
+        </w:rPr>
+        <w:t>Piranti ini digunakan untuk menunjuk atau menempatkan kursor pada layar serta mengambil atau memindahkan informasi. Fungsinya mencakup pemilihan, penempatan, orientasi, jalur, kuantisasi, dan input tekstual. Beberapa contoh perangkat ini ad</w:t>
+      </w:r>
+      <w:r>
+        <w:rPr>
+          <w:rFonts w:eastAsia="Times New Roman"/>
+          <w:color w:val="000000"/>
+          <w:lang w:val="en-US" w:eastAsia="en-US"/>
+        </w:rPr>
+        <w:t>alah:</w:t>
+      </w:r>
+    </w:p>
+    <w:p>
+      <w:pPr>
+        <w:spacing w:line="240" w:lineRule="auto"/>
+        <w:ind w:firstLine="720"/>
+        <w:jc w:val="both"/>
+        <w:rPr>
+          <w:rFonts w:ascii="Times New Roman" w:eastAsia="Times New Roman" w:hAnsi="Times New Roman" w:cs="Times New Roman"/>
+          <w:sz w:val="24"/>
+          <w:szCs w:val="24"/>
+          <w:lang w:val="en-US" w:eastAsia="en-US"/>
+        </w:rPr>
+      </w:pPr>
+    </w:p>
+    <w:p>
+      <w:pPr>
+        <w:spacing w:line="240" w:lineRule="auto"/>
+        <w:jc w:val="both"/>
+        <w:rPr>
+          <w:rFonts w:eastAsia="Times New Roman"/>
+          <w:color w:val="000000"/>
+          <w:lang w:val="en-US" w:eastAsia="en-US"/>
+        </w:rPr>
+      </w:pPr>
+      <w:r>
+        <w:rPr>
+          <w:rFonts w:eastAsia="Times New Roman"/>
+          <w:color w:val="000000"/>
+          <w:lang w:val="en-US" w:eastAsia="en-US"/>
+        </w:rPr>
+        <w:t>- Mouse: Menggabungkan fungsi pergerakan kursor dan pemilihan objek pada layar.  </w:t>
+      </w:r>
+    </w:p>
+    <w:p>
+      <w:pPr>
+        <w:spacing w:line="240" w:lineRule="auto"/>
+        <w:jc w:val="both"/>
+        <w:rPr>
+          <w:rFonts w:ascii="Times New Roman" w:eastAsia="Times New Roman" w:hAnsi="Times New Roman" w:cs="Times New Roman"/>
+          <w:sz w:val="24"/>
+          <w:szCs w:val="24"/>
+          <w:lang w:val="en-US" w:eastAsia="en-US"/>
+        </w:rPr>
+      </w:pPr>
+    </w:p>
+    <w:p>
+      <w:pPr>
+        <w:spacing w:line="240" w:lineRule="auto"/>
+        <w:jc w:val="both"/>
+        <w:rPr>
+          <w:rFonts w:eastAsia="Times New Roman"/>
+          <w:color w:val="000000"/>
+          <w:lang w:val="en-US" w:eastAsia="en-US"/>
+        </w:rPr>
+      </w:pPr>
+      <w:r>
+        <w:rPr>
+          <w:rFonts w:eastAsia="Times New Roman"/>
+          <w:color w:val="000000"/>
+          <w:lang w:val="en-US" w:eastAsia="en-US"/>
+        </w:rPr>
+        <w:t>- Joystick: Umumnya digunakan dalam permainan atau simulasi penerbangan. </w:t>
+      </w:r>
+    </w:p>
+    <w:p>
+      <w:pPr>
+        <w:spacing w:line="240" w:lineRule="auto"/>
+        <w:jc w:val="both"/>
+        <w:rPr>
+          <w:rFonts w:ascii="Times New Roman" w:eastAsia="Times New Roman" w:hAnsi="Times New Roman" w:cs="Times New Roman"/>
+          <w:sz w:val="24"/>
+          <w:szCs w:val="24"/>
+          <w:lang w:val="en-US" w:eastAsia="en-US"/>
+        </w:rPr>
+      </w:pPr>
+      <w:r>
+        <w:rPr>
+          <w:rFonts w:eastAsia="Times New Roman"/>
+          <w:color w:val="000000"/>
+          <w:lang w:val="en-US" w:eastAsia="en-US"/>
+        </w:rPr>
+        <w:t> </w:t>
+      </w:r>
+    </w:p>
+    <w:p>
+      <w:pPr>
+        <w:spacing w:line="240" w:lineRule="auto"/>
+        <w:jc w:val="both"/>
+        <w:rPr>
+          <w:rFonts w:eastAsia="Times New Roman"/>
+          <w:color w:val="000000"/>
+          <w:lang w:val="en-US" w:eastAsia="en-US"/>
+        </w:rPr>
+      </w:pPr>
+      <w:r>
+        <w:rPr>
+          <w:rFonts w:eastAsia="Times New Roman"/>
+          <w:color w:val="000000"/>
+          <w:lang w:val="en-US" w:eastAsia="en-US"/>
+        </w:rPr>
+        <w:t>- Trackball Mirip dengan mouse, tetapi dengan bola yang dapat digerakkan langsung oleh pengguna.  </w:t>
+      </w:r>
+    </w:p>
+    <w:p>
+      <w:pPr>
+        <w:spacing w:line="240" w:lineRule="auto"/>
+        <w:jc w:val="both"/>
+        <w:rPr>
+          <w:rFonts w:ascii="Times New Roman" w:eastAsia="Times New Roman" w:hAnsi="Times New Roman" w:cs="Times New Roman"/>
+          <w:sz w:val="24"/>
+          <w:szCs w:val="24"/>
+          <w:lang w:val="en-US" w:eastAsia="en-US"/>
+        </w:rPr>
+      </w:pPr>
+    </w:p>
+    <w:p>
+      <w:pPr>
+        <w:spacing w:line="240" w:lineRule="auto"/>
+        <w:jc w:val="both"/>
+        <w:rPr>
+          <w:rFonts w:eastAsia="Times New Roman"/>
+          <w:color w:val="000000"/>
+          <w:lang w:val="en-US" w:eastAsia="en-US"/>
+        </w:rPr>
+      </w:pPr>
+      <w:r>
+        <w:rPr>
+          <w:rFonts w:eastAsia="Times New Roman"/>
+          <w:color w:val="000000"/>
+          <w:lang w:val="en-US" w:eastAsia="en-US"/>
+        </w:rPr>
+        <w:t>- Digitizing Tablet: Digunakan dalam desain grafis untuk menggambar secara langsung di komputer.  </w:t>
+      </w:r>
+    </w:p>
+    <w:p>
+      <w:pPr>
+        <w:spacing w:line="240" w:lineRule="auto"/>
+        <w:jc w:val="both"/>
+        <w:rPr>
+          <w:rFonts w:ascii="Times New Roman" w:eastAsia="Times New Roman" w:hAnsi="Times New Roman" w:cs="Times New Roman"/>
+          <w:sz w:val="24"/>
+          <w:szCs w:val="24"/>
+          <w:lang w:val="en-US" w:eastAsia="en-US"/>
+        </w:rPr>
+      </w:pPr>
+    </w:p>
+    <w:p>
+      <w:pPr>
+        <w:spacing w:line="240" w:lineRule="auto"/>
+        <w:jc w:val="both"/>
+        <w:rPr>
+          <w:rFonts w:eastAsia="Times New Roman"/>
+          <w:color w:val="000000"/>
+          <w:lang w:val="en-US" w:eastAsia="en-US"/>
+        </w:rPr>
+      </w:pPr>
+      <w:r>
+        <w:rPr>
+          <w:rFonts w:eastAsia="Times New Roman"/>
+          <w:color w:val="000000"/>
+          <w:lang w:val="en-US" w:eastAsia="en-US"/>
+        </w:rPr>
+        <w:t>- Light Pen: Pena elektronik yang dapat digunakan untuk menunjuk atau menggambar pada layar.  </w:t>
+      </w:r>
+    </w:p>
+    <w:p>
+      <w:pPr>
+        <w:spacing w:line="240" w:lineRule="auto"/>
+        <w:jc w:val="both"/>
+        <w:rPr>
+          <w:rFonts w:ascii="Times New Roman" w:eastAsia="Times New Roman" w:hAnsi="Times New Roman" w:cs="Times New Roman"/>
+          <w:sz w:val="24"/>
+          <w:szCs w:val="24"/>
+          <w:lang w:val="en-US" w:eastAsia="en-US"/>
+        </w:rPr>
+      </w:pPr>
+      <w:bookmarkStart w:id="2" w:name="_GoBack"/>
+      <w:bookmarkEnd w:id="2"/>
+    </w:p>
+    <w:p>
+      <w:pPr>
+        <w:spacing w:line="240" w:lineRule="auto"/>
+        <w:jc w:val="both"/>
+        <w:rPr>
+          <w:rFonts w:ascii="Times New Roman" w:eastAsia="Times New Roman" w:hAnsi="Times New Roman" w:cs="Times New Roman"/>
+          <w:sz w:val="24"/>
+          <w:szCs w:val="24"/>
+          <w:lang w:val="en-US" w:eastAsia="en-US"/>
+        </w:rPr>
+      </w:pPr>
+      <w:r>
+        <w:rPr>
+          <w:rFonts w:eastAsia="Times New Roman"/>
+          <w:color w:val="000000"/>
+          <w:lang w:val="en-US" w:eastAsia="en-US"/>
+        </w:rPr>
+        <w:t>- Touch-Sensitive Panel: Layar sentuh yang memungkinkan pengguna berinteraksi langsung dengan tampilan melalui sentuhan jari.  </w:t>
+      </w:r>
+    </w:p>
+    <w:p>
+      <w:pPr>
+        <w:spacing w:line="240" w:lineRule="auto"/>
+        <w:rPr>
+          <w:rFonts w:ascii="Times New Roman" w:eastAsia="Times New Roman" w:hAnsi="Times New Roman" w:cs="Times New Roman"/>
+          <w:sz w:val="24"/>
+          <w:szCs w:val="24"/>
+          <w:lang w:val="en-US" w:eastAsia="en-US"/>
+        </w:rPr>
+      </w:pPr>
+    </w:p>
+    <w:p>
+      <w:pPr>
+        <w:spacing w:line="240" w:lineRule="auto"/>
+        <w:jc w:val="both"/>
+        <w:rPr>
+          <w:rFonts w:ascii="Times New Roman" w:eastAsia="Times New Roman" w:hAnsi="Times New Roman" w:cs="Times New Roman"/>
+          <w:sz w:val="24"/>
+          <w:szCs w:val="24"/>
+          <w:lang w:val="en-US" w:eastAsia="en-US"/>
+        </w:rPr>
+      </w:pPr>
+      <w:r>
+        <w:rPr>
+          <w:rFonts w:eastAsia="Times New Roman"/>
+          <w:color w:val="000000"/>
+          <w:lang w:val="en-US" w:eastAsia="en-US"/>
+        </w:rPr>
+        <w:t>Piranti interaktif, terutama yang mengontrol kursor, harus memiliki mekanisme pergerakan yang kontinu dan responsif agar mudah diamati serta digunakan oleh pengguna.</w:t>
+      </w:r>
+    </w:p>
+    <w:p>
+      <w:pPr>
+        <w:jc w:val="both"/>
+      </w:pPr>
     </w:p>
     <w:sectPr>
       <w:pgSz w:w="12240" w:h="15840"/>
@@ -512,7 +1322,7 @@
 </file>
 
 <file path=word/comments.xml><?xml version="1.0" encoding="utf-8"?>
-<w:comments xmlns:wpc="http://schemas.microsoft.com/office/word/2010/wordprocessingCanvas" xmlns:cx="http://schemas.microsoft.com/office/drawing/2014/chartex" xmlns:cx1="http://schemas.microsoft.com/office/drawing/2015/9/8/chartex" xmlns:cx2="http://schemas.microsoft.com/office/drawing/2015/10/21/chartex" xmlns:cx3="http://schemas.microsoft.com/office/drawing/2016/5/9/chartex" xmlns:cx4="http://schemas.microsoft.com/office/drawing/2016/5/10/chartex" xmlns:cx5="http://schemas.microsoft.com/office/drawing/2016/5/11/chartex" xmlns:cx6="http://schemas.microsoft.com/office/drawing/2016/5/12/chartex" xmlns:cx7="http://schemas.microsoft.com/office/drawing/2016/5/13/chartex" xmlns:cx8="http://schemas.microsoft.com/office/drawing/2016/5/14/chartex" xmlns:mc="http://schemas.openxmlformats.org/markup-compatibility/2006" xmlns:aink="http://schemas.microsoft.com/office/drawing/2016/ink" xmlns:am3d="http://schemas.microsoft.com/office/drawing/2017/model3d" xmlns:o="urn:schemas-microsoft-com:office:office" xmlns:oel="http://schemas.microsoft.com/office/2019/extlst" xmlns:r="http://schemas.openxmlformats.org/officeDocument/2006/relationships" xmlns:m="http://schemas.openxmlformats.org/officeDocument/2006/math" xmlns:v="urn:schemas-microsoft-com:vml" xmlns:wp14="http://schemas.microsoft.com/office/word/2010/wordprocessingDrawing" xmlns:wp="http://schemas.openxmlformats.org/drawingml/2006/wordprocessingDrawing" xmlns:w10="urn:schemas-microsoft-com:office:word" xmlns:w="http://schemas.openxmlformats.org/wordprocessingml/2006/main" xmlns:w14="http://schemas.microsoft.com/office/word/2010/wordml" xmlns:w15="http://schemas.microsoft.com/office/word/2012/wordml" xmlns:w16cex="http://schemas.microsoft.com/office/word/2018/wordml/cex" xmlns:w16cid="http://schemas.microsoft.com/office/word/2016/wordml/cid" xmlns:w16="http://schemas.microsoft.com/office/word/2018/wordml" xmlns:w16du="http://schemas.microsoft.com/office/word/2023/wordml/word16du" xmlns:w16sdtdh="http://schemas.microsoft.com/office/word/2020/wordml/sdtdatahash" xmlns:w16sdtfl="http://schemas.microsoft.com/office/word/2024/wordml/sdtformatlock" xmlns:w16se="http://schemas.microsoft.com/office/word/2015/wordml/symex" xmlns:wpg="http://schemas.microsoft.com/office/word/2010/wordprocessingGroup" xmlns:wpi="http://schemas.microsoft.com/office/word/2010/wordprocessingInk" xmlns:wne="http://schemas.microsoft.com/office/word/2006/wordml" xmlns:wps="http://schemas.microsoft.com/office/word/2010/wordprocessingShape" mc:Ignorable="w14 w15 w16se w16cid w16 w16cex w16sdtdh w16sdtfl w16du wp14">
+<w:comments xmlns:wpc="http://schemas.microsoft.com/office/word/2010/wordprocessingCanvas" xmlns:cx="http://schemas.microsoft.com/office/drawing/2014/chartex" xmlns:mc="http://schemas.openxmlformats.org/markup-compatibility/2006" xmlns:o="urn:schemas-microsoft-com:office:office" xmlns:r="http://schemas.openxmlformats.org/officeDocument/2006/relationships" xmlns:m="http://schemas.openxmlformats.org/officeDocument/2006/math" xmlns:v="urn:schemas-microsoft-com:vml" xmlns:wp14="http://schemas.microsoft.com/office/word/2010/wordprocessingDrawing" xmlns:wp="http://schemas.openxmlformats.org/drawingml/2006/wordprocessingDrawing" xmlns:w10="urn:schemas-microsoft-com:office:word" xmlns:w="http://schemas.openxmlformats.org/wordprocessingml/2006/main" xmlns:w14="http://schemas.microsoft.com/office/word/2010/wordml" xmlns:w15="http://schemas.microsoft.com/office/word/2012/wordml" xmlns:w16se="http://schemas.microsoft.com/office/word/2015/wordml/symex" xmlns:wpg="http://schemas.microsoft.com/office/word/2010/wordprocessingGroup" xmlns:wpi="http://schemas.microsoft.com/office/word/2010/wordprocessingInk" xmlns:wne="http://schemas.microsoft.com/office/word/2006/wordml" xmlns:wps="http://schemas.microsoft.com/office/word/2010/wordprocessingShape" mc:Ignorable="w14 w15 w16se wp14">
   <w:comment w:id="0" w:author="Ary Budi Warsito" w:date="2025-04-10T06:07:00Z" w:initials="">
     <w:p>
       <w:pPr>
@@ -537,29 +1347,12 @@
       </w:r>
     </w:p>
   </w:comment>
-  <w:comment w:id="2" w:author="Ary Budi Warsito" w:date="2025-04-10T16:16:00Z" w:initials="AB">
-    <w:p>
-      <w:pPr>
-        <w:pStyle w:val="CommentText"/>
-      </w:pPr>
-      <w:r>
-        <w:rPr>
-          <w:rStyle w:val="CommentReference"/>
-        </w:rPr>
-        <w:annotationRef/>
-      </w:r>
-      <w:r>
-        <w:t>Tolong buat lebih serius kembali. Terkait ini</w:t>
-      </w:r>
-    </w:p>
-  </w:comment>
 </w:comments>
 </file>
 
 <file path=word/commentsExtended.xml><?xml version="1.0" encoding="utf-8"?>
-<w15:commentsEx xmlns:wpc="http://schemas.microsoft.com/office/word/2010/wordprocessingCanvas" xmlns:cx="http://schemas.microsoft.com/office/drawing/2014/chartex" xmlns:cx1="http://schemas.microsoft.com/office/drawing/2015/9/8/chartex" xmlns:cx2="http://schemas.microsoft.com/office/drawing/2015/10/21/chartex" xmlns:cx3="http://schemas.microsoft.com/office/drawing/2016/5/9/chartex" xmlns:cx4="http://schemas.microsoft.com/office/drawing/2016/5/10/chartex" xmlns:cx5="http://schemas.microsoft.com/office/drawing/2016/5/11/chartex" xmlns:cx6="http://schemas.microsoft.com/office/drawing/2016/5/12/chartex" xmlns:cx7="http://schemas.microsoft.com/office/drawing/2016/5/13/chartex" xmlns:cx8="http://schemas.microsoft.com/office/drawing/2016/5/14/chartex" xmlns:mc="http://schemas.openxmlformats.org/markup-compatibility/2006" xmlns:aink="http://schemas.microsoft.com/office/drawing/2016/ink" xmlns:am3d="http://schemas.microsoft.com/office/drawing/2017/model3d" xmlns:o="urn:schemas-microsoft-com:office:office" xmlns:oel="http://schemas.microsoft.com/office/2019/extlst" xmlns:r="http://schemas.openxmlformats.org/officeDocument/2006/relationships" xmlns:m="http://schemas.openxmlformats.org/officeDocument/2006/math" xmlns:v="urn:schemas-microsoft-com:vml" xmlns:wp14="http://schemas.microsoft.com/office/word/2010/wordprocessingDrawing" xmlns:wp="http://schemas.openxmlformats.org/drawingml/2006/wordprocessingDrawing" xmlns:w10="urn:schemas-microsoft-com:office:word" xmlns:w="http://schemas.openxmlformats.org/wordprocessingml/2006/main" xmlns:w14="http://schemas.microsoft.com/office/word/2010/wordml" xmlns:w15="http://schemas.microsoft.com/office/word/2012/wordml" xmlns:w16cex="http://schemas.microsoft.com/office/word/2018/wordml/cex" xmlns:w16cid="http://schemas.microsoft.com/office/word/2016/wordml/cid" xmlns:w16="http://schemas.microsoft.com/office/word/2018/wordml" xmlns:w16du="http://schemas.microsoft.com/office/word/2023/wordml/word16du" xmlns:w16sdtdh="http://schemas.microsoft.com/office/word/2020/wordml/sdtdatahash" xmlns:w16sdtfl="http://schemas.microsoft.com/office/word/2024/wordml/sdtformatlock" xmlns:w16se="http://schemas.microsoft.com/office/word/2015/wordml/symex" xmlns:wpg="http://schemas.microsoft.com/office/word/2010/wordprocessingGroup" xmlns:wpi="http://schemas.microsoft.com/office/word/2010/wordprocessingInk" xmlns:wne="http://schemas.microsoft.com/office/word/2006/wordml" xmlns:wps="http://schemas.microsoft.com/office/word/2010/wordprocessingShape" mc:Ignorable="w14 w15 w16se w16cid w16 w16cex w16sdtdh w16sdtfl w16du wp14">
+<w15:commentsEx xmlns:wpc="http://schemas.microsoft.com/office/word/2010/wordprocessingCanvas" xmlns:cx="http://schemas.microsoft.com/office/drawing/2014/chartex" xmlns:mc="http://schemas.openxmlformats.org/markup-compatibility/2006" xmlns:o="urn:schemas-microsoft-com:office:office" xmlns:r="http://schemas.openxmlformats.org/officeDocument/2006/relationships" xmlns:m="http://schemas.openxmlformats.org/officeDocument/2006/math" xmlns:v="urn:schemas-microsoft-com:vml" xmlns:wp14="http://schemas.microsoft.com/office/word/2010/wordprocessingDrawing" xmlns:wp="http://schemas.openxmlformats.org/drawingml/2006/wordprocessingDrawing" xmlns:w10="urn:schemas-microsoft-com:office:word" xmlns:w="http://schemas.openxmlformats.org/wordprocessingml/2006/main" xmlns:w14="http://schemas.microsoft.com/office/word/2010/wordml" xmlns:w15="http://schemas.microsoft.com/office/word/2012/wordml" xmlns:w16se="http://schemas.microsoft.com/office/word/2015/wordml/symex" xmlns:wpg="http://schemas.microsoft.com/office/word/2010/wordprocessingGroup" xmlns:wpi="http://schemas.microsoft.com/office/word/2010/wordprocessingInk" xmlns:wne="http://schemas.microsoft.com/office/word/2006/wordml" xmlns:wps="http://schemas.microsoft.com/office/word/2010/wordprocessingShape" mc:Ignorable="w14 w15 w16se wp14">
   <w15:commentEx w15:paraId="508ED125" w15:done="0"/>
-  <w15:commentEx w15:paraId="26CDDA74" w15:done="0"/>
 </w15:commentsEx>
 </file>
 
@@ -577,7 +1370,7 @@
 </file>
 
 <file path=word/numbering.xml><?xml version="1.0" encoding="utf-8"?>
-<w:numbering xmlns:wpc="http://schemas.microsoft.com/office/word/2010/wordprocessingCanvas" xmlns:cx="http://schemas.microsoft.com/office/drawing/2014/chartex" xmlns:cx1="http://schemas.microsoft.com/office/drawing/2015/9/8/chartex" xmlns:cx2="http://schemas.microsoft.com/office/drawing/2015/10/21/chartex" xmlns:cx3="http://schemas.microsoft.com/office/drawing/2016/5/9/chartex" xmlns:cx4="http://schemas.microsoft.com/office/drawing/2016/5/10/chartex" xmlns:cx5="http://schemas.microsoft.com/office/drawing/2016/5/11/chartex" xmlns:cx6="http://schemas.microsoft.com/office/drawing/2016/5/12/chartex" xmlns:cx7="http://schemas.microsoft.com/office/drawing/2016/5/13/chartex" xmlns:cx8="http://schemas.microsoft.com/office/drawing/2016/5/14/chartex" xmlns:mc="http://schemas.openxmlformats.org/markup-compatibility/2006" xmlns:aink="http://schemas.microsoft.com/office/drawing/2016/ink" xmlns:am3d="http://schemas.microsoft.com/office/drawing/2017/model3d" xmlns:o="urn:schemas-microsoft-com:office:office" xmlns:oel="http://schemas.microsoft.com/office/2019/extlst" xmlns:r="http://schemas.openxmlformats.org/officeDocument/2006/relationships" xmlns:m="http://schemas.openxmlformats.org/officeDocument/2006/math" xmlns:v="urn:schemas-microsoft-com:vml" xmlns:wp14="http://schemas.microsoft.com/office/word/2010/wordprocessingDrawing" xmlns:wp="http://schemas.openxmlformats.org/drawingml/2006/wordprocessingDrawing" xmlns:w10="urn:schemas-microsoft-com:office:word" xmlns:w="http://schemas.openxmlformats.org/wordprocessingml/2006/main" xmlns:w14="http://schemas.microsoft.com/office/word/2010/wordml" xmlns:w15="http://schemas.microsoft.com/office/word/2012/wordml" xmlns:w16cex="http://schemas.microsoft.com/office/word/2018/wordml/cex" xmlns:w16cid="http://schemas.microsoft.com/office/word/2016/wordml/cid" xmlns:w16="http://schemas.microsoft.com/office/word/2018/wordml" xmlns:w16du="http://schemas.microsoft.com/office/word/2023/wordml/word16du" xmlns:w16sdtdh="http://schemas.microsoft.com/office/word/2020/wordml/sdtdatahash" xmlns:w16sdtfl="http://schemas.microsoft.com/office/word/2024/wordml/sdtformatlock" xmlns:w16se="http://schemas.microsoft.com/office/word/2015/wordml/symex" xmlns:wpg="http://schemas.microsoft.com/office/word/2010/wordprocessingGroup" xmlns:wpi="http://schemas.microsoft.com/office/word/2010/wordprocessingInk" xmlns:wne="http://schemas.microsoft.com/office/word/2006/wordml" xmlns:wps="http://schemas.microsoft.com/office/word/2010/wordprocessingShape" mc:Ignorable="w14 w15 w16se w16cid w16 w16cex w16sdtdh w16sdtfl w16du wp14">
+<w:numbering xmlns:wpc="http://schemas.microsoft.com/office/word/2010/wordprocessingCanvas" xmlns:cx="http://schemas.microsoft.com/office/drawing/2014/chartex" xmlns:mc="http://schemas.openxmlformats.org/markup-compatibility/2006" xmlns:o="urn:schemas-microsoft-com:office:office" xmlns:r="http://schemas.openxmlformats.org/officeDocument/2006/relationships" xmlns:m="http://schemas.openxmlformats.org/officeDocument/2006/math" xmlns:v="urn:schemas-microsoft-com:vml" xmlns:wp14="http://schemas.microsoft.com/office/word/2010/wordprocessingDrawing" xmlns:wp="http://schemas.openxmlformats.org/drawingml/2006/wordprocessingDrawing" xmlns:w10="urn:schemas-microsoft-com:office:word" xmlns:w="http://schemas.openxmlformats.org/wordprocessingml/2006/main" xmlns:w14="http://schemas.microsoft.com/office/word/2010/wordml" xmlns:w15="http://schemas.microsoft.com/office/word/2012/wordml" xmlns:w16se="http://schemas.microsoft.com/office/word/2015/wordml/symex" xmlns:wpg="http://schemas.microsoft.com/office/word/2010/wordprocessingGroup" xmlns:wpi="http://schemas.microsoft.com/office/word/2010/wordprocessingInk" xmlns:wne="http://schemas.microsoft.com/office/word/2006/wordml" xmlns:wps="http://schemas.microsoft.com/office/word/2010/wordprocessingShape" mc:Ignorable="w14 w15 w16se wp14">
   <w:abstractNum w:abstractNumId="0" w15:restartNumberingAfterBreak="0">
     <w:nsid w:val="1FAB1057"/>
     <w:multiLevelType w:val="multilevel"/>
@@ -691,14 +1484,14 @@
       </w:rPr>
     </w:lvl>
   </w:abstractNum>
-  <w:num w:numId="1" w16cid:durableId="1242372928">
+  <w:num w:numId="1">
     <w:abstractNumId w:val="0"/>
   </w:num>
 </w:numbering>
 </file>
 
 <file path=word/people.xml><?xml version="1.0" encoding="utf-8"?>
-<w15:people xmlns:wpc="http://schemas.microsoft.com/office/word/2010/wordprocessingCanvas" xmlns:cx="http://schemas.microsoft.com/office/drawing/2014/chartex" xmlns:cx1="http://schemas.microsoft.com/office/drawing/2015/9/8/chartex" xmlns:cx2="http://schemas.microsoft.com/office/drawing/2015/10/21/chartex" xmlns:cx3="http://schemas.microsoft.com/office/drawing/2016/5/9/chartex" xmlns:cx4="http://schemas.microsoft.com/office/drawing/2016/5/10/chartex" xmlns:cx5="http://schemas.microsoft.com/office/drawing/2016/5/11/chartex" xmlns:cx6="http://schemas.microsoft.com/office/drawing/2016/5/12/chartex" xmlns:cx7="http://schemas.microsoft.com/office/drawing/2016/5/13/chartex" xmlns:cx8="http://schemas.microsoft.com/office/drawing/2016/5/14/chartex" xmlns:mc="http://schemas.openxmlformats.org/markup-compatibility/2006" xmlns:aink="http://schemas.microsoft.com/office/drawing/2016/ink" xmlns:am3d="http://schemas.microsoft.com/office/drawing/2017/model3d" xmlns:o="urn:schemas-microsoft-com:office:office" xmlns:oel="http://schemas.microsoft.com/office/2019/extlst" xmlns:r="http://schemas.openxmlformats.org/officeDocument/2006/relationships" xmlns:m="http://schemas.openxmlformats.org/officeDocument/2006/math" xmlns:v="urn:schemas-microsoft-com:vml" xmlns:wp14="http://schemas.microsoft.com/office/word/2010/wordprocessingDrawing" xmlns:wp="http://schemas.openxmlformats.org/drawingml/2006/wordprocessingDrawing" xmlns:w10="urn:schemas-microsoft-com:office:word" xmlns:w="http://schemas.openxmlformats.org/wordprocessingml/2006/main" xmlns:w14="http://schemas.microsoft.com/office/word/2010/wordml" xmlns:w15="http://schemas.microsoft.com/office/word/2012/wordml" xmlns:w16cex="http://schemas.microsoft.com/office/word/2018/wordml/cex" xmlns:w16cid="http://schemas.microsoft.com/office/word/2016/wordml/cid" xmlns:w16="http://schemas.microsoft.com/office/word/2018/wordml" xmlns:w16du="http://schemas.microsoft.com/office/word/2023/wordml/word16du" xmlns:w16sdtdh="http://schemas.microsoft.com/office/word/2020/wordml/sdtdatahash" xmlns:w16sdtfl="http://schemas.microsoft.com/office/word/2024/wordml/sdtformatlock" xmlns:w16se="http://schemas.microsoft.com/office/word/2015/wordml/symex" xmlns:wpg="http://schemas.microsoft.com/office/word/2010/wordprocessingGroup" xmlns:wpi="http://schemas.microsoft.com/office/word/2010/wordprocessingInk" xmlns:wne="http://schemas.microsoft.com/office/word/2006/wordml" xmlns:wps="http://schemas.microsoft.com/office/word/2010/wordprocessingShape" mc:Ignorable="w14 w15 w16se w16cid w16 w16cex w16sdtdh w16sdtfl w16du wp14">
+<w15:people xmlns:wpc="http://schemas.microsoft.com/office/word/2010/wordprocessingCanvas" xmlns:cx="http://schemas.microsoft.com/office/drawing/2014/chartex" xmlns:mc="http://schemas.openxmlformats.org/markup-compatibility/2006" xmlns:o="urn:schemas-microsoft-com:office:office" xmlns:r="http://schemas.openxmlformats.org/officeDocument/2006/relationships" xmlns:m="http://schemas.openxmlformats.org/officeDocument/2006/math" xmlns:v="urn:schemas-microsoft-com:vml" xmlns:wp14="http://schemas.microsoft.com/office/word/2010/wordprocessingDrawing" xmlns:wp="http://schemas.openxmlformats.org/drawingml/2006/wordprocessingDrawing" xmlns:w10="urn:schemas-microsoft-com:office:word" xmlns:w="http://schemas.openxmlformats.org/wordprocessingml/2006/main" xmlns:w14="http://schemas.microsoft.com/office/word/2010/wordml" xmlns:w15="http://schemas.microsoft.com/office/word/2012/wordml" xmlns:w16se="http://schemas.microsoft.com/office/word/2015/wordml/symex" xmlns:wpg="http://schemas.microsoft.com/office/word/2010/wordprocessingGroup" xmlns:wpi="http://schemas.microsoft.com/office/word/2010/wordprocessingInk" xmlns:wne="http://schemas.microsoft.com/office/word/2006/wordml" xmlns:wps="http://schemas.microsoft.com/office/word/2010/wordprocessingShape" mc:Ignorable="w14 w15 w16se wp14">
   <w15:person w15:author="Ary Budi Warsito">
     <w15:presenceInfo w15:providerId="AD" w15:userId="S::ary@matanauniv.ac.id::88101048-d0b9-4b07-8854-2bd95af52431"/>
   </w15:person>
@@ -706,7 +1499,7 @@
 </file>
 
 <file path=word/styles.xml><?xml version="1.0" encoding="utf-8"?>
-<w:styles xmlns:mc="http://schemas.openxmlformats.org/markup-compatibility/2006" xmlns:r="http://schemas.openxmlformats.org/officeDocument/2006/relationships" xmlns:w="http://schemas.openxmlformats.org/wordprocessingml/2006/main" xmlns:w14="http://schemas.microsoft.com/office/word/2010/wordml" xmlns:w15="http://schemas.microsoft.com/office/word/2012/wordml" xmlns:w16cex="http://schemas.microsoft.com/office/word/2018/wordml/cex" xmlns:w16cid="http://schemas.microsoft.com/office/word/2016/wordml/cid" xmlns:w16="http://schemas.microsoft.com/office/word/2018/wordml" xmlns:w16du="http://schemas.microsoft.com/office/word/2023/wordml/word16du" xmlns:w16sdtdh="http://schemas.microsoft.com/office/word/2020/wordml/sdtdatahash" xmlns:w16sdtfl="http://schemas.microsoft.com/office/word/2024/wordml/sdtformatlock" xmlns:w16se="http://schemas.microsoft.com/office/word/2015/wordml/symex" mc:Ignorable="w14 w15 w16se w16cid w16 w16cex w16sdtdh w16sdtfl w16du">
+<w:styles xmlns:mc="http://schemas.openxmlformats.org/markup-compatibility/2006" xmlns:r="http://schemas.openxmlformats.org/officeDocument/2006/relationships" xmlns:w="http://schemas.openxmlformats.org/wordprocessingml/2006/main" xmlns:w14="http://schemas.microsoft.com/office/word/2010/wordml" xmlns:w15="http://schemas.microsoft.com/office/word/2012/wordml" xmlns:w16se="http://schemas.microsoft.com/office/word/2015/wordml/symex" mc:Ignorable="w14 w15 w16se">
   <w:docDefaults>
     <w:rPrDefault>
       <w:rPr>
@@ -722,7 +1515,7 @@
       </w:pPr>
     </w:pPrDefault>
   </w:docDefaults>
-  <w:latentStyles w:defLockedState="0" w:defUIPriority="99" w:defSemiHidden="0" w:defUnhideWhenUsed="0" w:defQFormat="0" w:count="376">
+  <w:latentStyles w:defLockedState="0" w:defUIPriority="99" w:defSemiHidden="0" w:defUnhideWhenUsed="0" w:defQFormat="0" w:count="371">
     <w:lsdException w:name="Normal" w:uiPriority="0" w:qFormat="1"/>
     <w:lsdException w:name="heading 1" w:uiPriority="9" w:qFormat="1"/>
     <w:lsdException w:name="heading 2" w:semiHidden="1" w:uiPriority="9" w:unhideWhenUsed="1" w:qFormat="1"/>
@@ -1094,11 +1887,6 @@
     <w:lsdException w:name="List Table 5 Dark Accent 6" w:uiPriority="50"/>
     <w:lsdException w:name="List Table 6 Colorful Accent 6" w:uiPriority="51"/>
     <w:lsdException w:name="List Table 7 Colorful Accent 6" w:uiPriority="52"/>
-    <w:lsdException w:name="Mention" w:semiHidden="1" w:unhideWhenUsed="1"/>
-    <w:lsdException w:name="Smart Hyperlink" w:semiHidden="1" w:unhideWhenUsed="1"/>
-    <w:lsdException w:name="Hashtag" w:semiHidden="1" w:unhideWhenUsed="1"/>
-    <w:lsdException w:name="Unresolved Mention" w:semiHidden="1" w:unhideWhenUsed="1"/>
-    <w:lsdException w:name="Smart Link" w:semiHidden="1" w:unhideWhenUsed="1"/>
   </w:latentStyles>
   <w:style w:type="paragraph" w:default="1" w:styleId="Normal">
     <w:name w:val="Normal"/>
@@ -1338,6 +2126,53 @@
       <w:bCs/>
       <w:sz w:val="20"/>
       <w:szCs w:val="20"/>
+    </w:rPr>
+  </w:style>
+  <w:style w:type="paragraph" w:styleId="BalloonText">
+    <w:name w:val="Balloon Text"/>
+    <w:basedOn w:val="Normal"/>
+    <w:link w:val="BalloonTextChar"/>
+    <w:uiPriority w:val="99"/>
+    <w:semiHidden/>
+    <w:unhideWhenUsed/>
+    <w:rsid w:val="003A5FFF"/>
+    <w:pPr>
+      <w:spacing w:line="240" w:lineRule="auto"/>
+    </w:pPr>
+    <w:rPr>
+      <w:rFonts w:ascii="Segoe UI" w:hAnsi="Segoe UI" w:cs="Segoe UI"/>
+      <w:sz w:val="18"/>
+      <w:szCs w:val="18"/>
+    </w:rPr>
+  </w:style>
+  <w:style w:type="character" w:customStyle="1" w:styleId="BalloonTextChar">
+    <w:name w:val="Balloon Text Char"/>
+    <w:basedOn w:val="DefaultParagraphFont"/>
+    <w:link w:val="BalloonText"/>
+    <w:uiPriority w:val="99"/>
+    <w:semiHidden/>
+    <w:rsid w:val="003A5FFF"/>
+    <w:rPr>
+      <w:rFonts w:ascii="Segoe UI" w:hAnsi="Segoe UI" w:cs="Segoe UI"/>
+      <w:sz w:val="18"/>
+      <w:szCs w:val="18"/>
+    </w:rPr>
+  </w:style>
+  <w:style w:type="paragraph" w:styleId="NormalWeb">
+    <w:name w:val="Normal (Web)"/>
+    <w:basedOn w:val="Normal"/>
+    <w:uiPriority w:val="99"/>
+    <w:semiHidden/>
+    <w:unhideWhenUsed/>
+    <w:rsid w:val="003A5FFF"/>
+    <w:pPr>
+      <w:spacing w:before="100" w:beforeAutospacing="1" w:after="100" w:afterAutospacing="1" w:line="240" w:lineRule="auto"/>
+    </w:pPr>
+    <w:rPr>
+      <w:rFonts w:ascii="Times New Roman" w:eastAsia="Times New Roman" w:hAnsi="Times New Roman" w:cs="Times New Roman"/>
+      <w:sz w:val="24"/>
+      <w:szCs w:val="24"/>
+      <w:lang w:val="en-US" w:eastAsia="en-US"/>
     </w:rPr>
   </w:style>
 </w:styles>

</xml_diff>